<commit_message>
Resume: add Standing Akimbo, replace arrows with commas
Co-Authored-By: Claude Opus 4.8 <noreply@anthropic.com>
Claude-Session: https://claude.ai/code/session_01GdRq6K4rhrYqfc6tg9hmug
</commit_message>
<xml_diff>
--- a/resumes/Joshua_Rotenberg_Resume.docx
+++ b/resumes/Joshua_Rotenberg_Resume.docx
@@ -80,7 +80,7 @@
           <w:sz w:val="19"/>
           <w:szCs w:val="19"/>
         </w:rPr>
-        <w:t xml:space="preserve">Marketing operations leader and CRM architect with 15+ years in marketing/revenue operations and 5+ years building CRM and marketing-automation systems — primarily in GoHighLevel, with hands-on HubSpot client builds. Founder of Solenzo, architecting complete full-lifecycle automation engines (lead capture → qualification → booking → onboarding → nurture/reactivation → reviews → cold outreach) for agencies and service-based businesses. Track record across SaaS onboarding, partner/account management, and revenue growth, with strong client retention and consistent quota over-attainment.</w:t>
+        <w:t xml:space="preserve">Marketing operations leader and CRM architect with 15+ years in marketing/revenue operations and 5+ years building CRM and marketing-automation systems — primarily in GoHighLevel, with hands-on HubSpot client builds. Founder of Solenzo, architecting complete full-lifecycle automation engines — lead capture, qualification, booking, onboarding, nurture/reactivation, reviews, and cold outreach — for agencies and service-based businesses. Track record across SaaS onboarding, partner/account management, and revenue growth, with strong client retention and consistent quota over-attainment.</w:t>
       </w:r>
     </w:p>
     <w:p>
@@ -918,6 +918,55 @@
           <w:szCs w:val="18"/>
         </w:rPr>
         <w:t xml:space="preserve">Ran full-cycle sales for a loyalty and marketing-automation platform targeting SMBs — prospecting, qualification, and customer acquisition.</w:t>
+      </w:r>
+    </w:p>
+    <w:p>
+      <w:pPr>
+        <w:tabs>
+          <w:tab w:val="right" w:pos="9026"/>
+        </w:tabs>
+        <w:spacing w:after="20" w:before="120"/>
+      </w:pPr>
+      <w:r>
+        <w:rPr>
+          <w:rFonts w:ascii="Calibri" w:cs="Calibri" w:eastAsia="Calibri" w:hAnsi="Calibri"/>
+          <w:b/>
+          <w:bCs/>
+          <w:color w:val="000000"/>
+          <w:sz w:val="19"/>
+          <w:szCs w:val="19"/>
+        </w:rPr>
+        <w:t xml:space="preserve">Co-Owner &amp; Operations Lead — Standing Akimbo</w:t>
+      </w:r>
+      <w:r>
+        <w:rPr>
+          <w:rFonts w:ascii="Calibri" w:cs="Calibri" w:eastAsia="Calibri" w:hAnsi="Calibri"/>
+          <w:i/>
+          <w:iCs/>
+          <w:color w:val="444444"/>
+          <w:sz w:val="18"/>
+          <w:szCs w:val="18"/>
+        </w:rPr>
+        <w:t xml:space="preserve">	Jun 2010 – Sep 2012</w:t>
+      </w:r>
+    </w:p>
+    <w:p>
+      <w:pPr>
+        <w:pStyle w:val="ListParagraph"/>
+        <w:numPr>
+          <w:ilvl w:val="0"/>
+          <w:numId w:val="1"/>
+        </w:numPr>
+        <w:spacing w:after="30"/>
+      </w:pPr>
+      <w:r>
+        <w:rPr>
+          <w:rFonts w:ascii="Calibri" w:cs="Calibri" w:eastAsia="Calibri" w:hAnsi="Calibri"/>
+          <w:color w:val="444444"/>
+          <w:sz w:val="18"/>
+          <w:szCs w:val="18"/>
+        </w:rPr>
+        <w:t xml:space="preserve">Co-founded a startup in a highly regulated industry; built operational and compliance infrastructure from the ground up — intake processes, reporting systems, and customer, vendor, and supplier workflows — scaling the business to profitability.</w:t>
       </w:r>
     </w:p>
     <w:p>

</xml_diff>

<commit_message>
Add Senior Directory BDR role (2012-2016) to close timeline gap
Co-Authored-By: Claude Opus 4.8 <noreply@anthropic.com>
Claude-Session: https://claude.ai/code/session_01GdRq6K4rhrYqfc6tg9hmug
</commit_message>
<xml_diff>
--- a/resumes/Joshua_Rotenberg_Resume.docx
+++ b/resumes/Joshua_Rotenberg_Resume.docx
@@ -918,6 +918,74 @@
           <w:szCs w:val="18"/>
         </w:rPr>
         <w:t xml:space="preserve">Ran full-cycle sales for a loyalty and marketing-automation platform targeting SMBs — prospecting, qualification, and customer acquisition.</w:t>
+      </w:r>
+    </w:p>
+    <w:p>
+      <w:pPr>
+        <w:tabs>
+          <w:tab w:val="right" w:pos="9026"/>
+        </w:tabs>
+        <w:spacing w:after="20" w:before="120"/>
+      </w:pPr>
+      <w:r>
+        <w:rPr>
+          <w:rFonts w:ascii="Calibri" w:cs="Calibri" w:eastAsia="Calibri" w:hAnsi="Calibri"/>
+          <w:b/>
+          <w:bCs/>
+          <w:color w:val="000000"/>
+          <w:sz w:val="19"/>
+          <w:szCs w:val="19"/>
+        </w:rPr>
+        <w:t xml:space="preserve">Business Development Representative — Senior Directory</w:t>
+      </w:r>
+      <w:r>
+        <w:rPr>
+          <w:rFonts w:ascii="Calibri" w:cs="Calibri" w:eastAsia="Calibri" w:hAnsi="Calibri"/>
+          <w:i/>
+          <w:iCs/>
+          <w:color w:val="444444"/>
+          <w:sz w:val="18"/>
+          <w:szCs w:val="18"/>
+        </w:rPr>
+        <w:t xml:space="preserve">	2012 – 2016</w:t>
+      </w:r>
+    </w:p>
+    <w:p>
+      <w:pPr>
+        <w:pStyle w:val="ListParagraph"/>
+        <w:numPr>
+          <w:ilvl w:val="0"/>
+          <w:numId w:val="1"/>
+        </w:numPr>
+        <w:spacing w:after="30"/>
+      </w:pPr>
+      <w:r>
+        <w:rPr>
+          <w:rFonts w:ascii="Calibri" w:cs="Calibri" w:eastAsia="Calibri" w:hAnsi="Calibri"/>
+          <w:color w:val="444444"/>
+          <w:sz w:val="18"/>
+          <w:szCs w:val="18"/>
+        </w:rPr>
+        <w:t xml:space="preserve">Prospected and qualified leads as a Business Development Representative, booking appointments for regional sales representatives and maintaining a steady flow of sales-ready meetings.</w:t>
+      </w:r>
+    </w:p>
+    <w:p>
+      <w:pPr>
+        <w:pStyle w:val="ListParagraph"/>
+        <w:numPr>
+          <w:ilvl w:val="0"/>
+          <w:numId w:val="1"/>
+        </w:numPr>
+        <w:spacing w:after="30"/>
+      </w:pPr>
+      <w:r>
+        <w:rPr>
+          <w:rFonts w:ascii="Calibri" w:cs="Calibri" w:eastAsia="Calibri" w:hAnsi="Calibri"/>
+          <w:color w:val="444444"/>
+          <w:sz w:val="18"/>
+          <w:szCs w:val="18"/>
+        </w:rPr>
+        <w:t xml:space="preserve">Developed the consultative outreach, qualification, and pipeline-building fundamentals that carried into later SaaS Account Executive roles.</w:t>
       </w:r>
     </w:p>
     <w:p>

</xml_diff>

<commit_message>
Resume: remove all em dashes, rewrite copy to read naturally
Co-Authored-By: Claude Opus 4.8 <noreply@anthropic.com>
Claude-Session: https://claude.ai/code/session_01GdRq6K4rhrYqfc6tg9hmug
</commit_message>
<xml_diff>
--- a/resumes/Joshua_Rotenberg_Resume.docx
+++ b/resumes/Joshua_Rotenberg_Resume.docx
@@ -80,7 +80,7 @@
           <w:sz w:val="19"/>
           <w:szCs w:val="19"/>
         </w:rPr>
-        <w:t xml:space="preserve">Marketing operations leader and CRM architect with 15+ years in marketing/revenue operations and 5+ years building CRM and marketing-automation systems — primarily in GoHighLevel, with hands-on HubSpot client builds. Founder of Solenzo, architecting complete full-lifecycle automation engines — lead capture, qualification, booking, onboarding, nurture/reactivation, reviews, and cold outreach — for agencies and service-based businesses. Track record across SaaS onboarding, partner/account management, and revenue growth, with strong client retention and consistent quota over-attainment.</w:t>
+        <w:t xml:space="preserve">Marketing operations leader and CRM architect with 15+ years in marketing and revenue operations, including 5+ years building CRM and marketing-automation systems, primarily in GoHighLevel and with hands-on HubSpot client builds. As founder of Solenzo, I architect complete full-lifecycle automation engines that cover lead capture, qualification, booking, onboarding, nurture and reactivation, reviews, and cold outreach for agencies and service-based businesses. I bring a strong track record across SaaS onboarding, partner and account management, and revenue growth, with high client retention and consistent quota over-attainment.</w:t>
       </w:r>
     </w:p>
     <w:p>
@@ -264,7 +264,7 @@
           <w:sz w:val="19"/>
           <w:szCs w:val="19"/>
         </w:rPr>
-        <w:t xml:space="preserve">Founder &amp; Marketing Operations / Automation Lead — Solenzo LLC</w:t>
+        <w:t xml:space="preserve">Founder &amp; Marketing Operations / Automation Lead · Solenzo LLC</w:t>
       </w:r>
       <w:r>
         <w:rPr>
@@ -305,16 +305,16 @@
           <w:sz w:val="18"/>
           <w:szCs w:val="18"/>
         </w:rPr>
-        <w:t xml:space="preserve">complete GoHighLevel automation system — 20+ workflows</w:t>
-      </w:r>
-      <w:r>
-        <w:rPr>
-          <w:rFonts w:ascii="Calibri" w:cs="Calibri" w:eastAsia="Calibri" w:hAnsi="Calibri"/>
-          <w:color w:val="444444"/>
-          <w:sz w:val="18"/>
-          <w:szCs w:val="18"/>
-        </w:rPr>
-        <w:t xml:space="preserve"> spanning lead capture/tagging/routing, qualification, appointment booking with confirmation and reminders, no-show recovery, post-sale onboarding nurture, long-term nurture/reactivation, and automated review-generation sequences.</w:t>
+        <w:t xml:space="preserve">complete GoHighLevel automation system of 20+ workflows</w:t>
+      </w:r>
+      <w:r>
+        <w:rPr>
+          <w:rFonts w:ascii="Calibri" w:cs="Calibri" w:eastAsia="Calibri" w:hAnsi="Calibri"/>
+          <w:color w:val="444444"/>
+          <w:sz w:val="18"/>
+          <w:szCs w:val="18"/>
+        </w:rPr>
+        <w:t xml:space="preserve"> covering lead capture, tagging and routing, qualification, appointment booking with confirmation and reminders, no-show recovery, post-sale onboarding nurture, long-term nurture and reactivation, and automated review generation.</w:t>
       </w:r>
     </w:p>
     <w:p>
@@ -344,7 +344,7 @@
           <w:sz w:val="18"/>
           <w:szCs w:val="18"/>
         </w:rPr>
-        <w:t xml:space="preserve">prospect "audit" workflow (180+ contacts enrolled)</w:t>
+        <w:t xml:space="preserve">prospect “audit” workflow (180+ contacts enrolled)</w:t>
       </w:r>
       <w:r>
         <w:rPr>
@@ -372,26 +372,26 @@
           <w:sz w:val="18"/>
           <w:szCs w:val="18"/>
         </w:rPr>
-        <w:t xml:space="preserve">Architect autonomous, AI-driven marketing systems that automate lead enrichment, outreach, and appointment booking; break manual workflows into agent architectures with custom scoring logic.</w:t>
-      </w:r>
-    </w:p>
-    <w:p>
-      <w:pPr>
-        <w:pStyle w:val="ListParagraph"/>
-        <w:numPr>
-          <w:ilvl w:val="0"/>
-          <w:numId w:val="1"/>
-        </w:numPr>
-        <w:spacing w:after="30"/>
-      </w:pPr>
-      <w:r>
-        <w:rPr>
-          <w:rFonts w:ascii="Calibri" w:cs="Calibri" w:eastAsia="Calibri" w:hAnsi="Calibri"/>
-          <w:color w:val="444444"/>
-          <w:sz w:val="18"/>
-          <w:szCs w:val="18"/>
-        </w:rPr>
-        <w:t xml:space="preserve">Optimized a client’s Google Ads account — cut spam/low-quality leads and improved click-through quality — and diagnosed on-site CRO as the remaining conversion bottleneck, demonstrating full-funnel troubleshooting.</w:t>
+        <w:t xml:space="preserve">Architect autonomous, AI-driven marketing systems that automate lead enrichment, outreach, and appointment booking, breaking manual workflows into agent architectures with custom scoring logic.</w:t>
+      </w:r>
+    </w:p>
+    <w:p>
+      <w:pPr>
+        <w:pStyle w:val="ListParagraph"/>
+        <w:numPr>
+          <w:ilvl w:val="0"/>
+          <w:numId w:val="1"/>
+        </w:numPr>
+        <w:spacing w:after="30"/>
+      </w:pPr>
+      <w:r>
+        <w:rPr>
+          <w:rFonts w:ascii="Calibri" w:cs="Calibri" w:eastAsia="Calibri" w:hAnsi="Calibri"/>
+          <w:color w:val="444444"/>
+          <w:sz w:val="18"/>
+          <w:szCs w:val="18"/>
+        </w:rPr>
+        <w:t xml:space="preserve">Optimized a client’s Google Ads account by cutting spam and low-quality leads and improving click-through quality, then traced the remaining conversion loss to on-site CRO, showing full-funnel judgment.</w:t>
       </w:r>
     </w:p>
     <w:p>
@@ -429,7 +429,7 @@
           <w:sz w:val="19"/>
           <w:szCs w:val="19"/>
         </w:rPr>
-        <w:t xml:space="preserve">Account Executive / Client Strategist — Level Agency</w:t>
+        <w:t xml:space="preserve">Account Executive / Client Strategist · Level Agency</w:t>
       </w:r>
       <w:r>
         <w:rPr>
@@ -459,26 +459,26 @@
           <w:sz w:val="18"/>
           <w:szCs w:val="18"/>
         </w:rPr>
-        <w:t xml:space="preserve">Managed integrated digital marketing strategies across inbound, paid media, and content; coordinated execution across internal departments as strategic lead.</w:t>
-      </w:r>
-    </w:p>
-    <w:p>
-      <w:pPr>
-        <w:pStyle w:val="ListParagraph"/>
-        <w:numPr>
-          <w:ilvl w:val="0"/>
-          <w:numId w:val="1"/>
-        </w:numPr>
-        <w:spacing w:after="30"/>
-      </w:pPr>
-      <w:r>
-        <w:rPr>
-          <w:rFonts w:ascii="Calibri" w:cs="Calibri" w:eastAsia="Calibri" w:hAnsi="Calibri"/>
-          <w:color w:val="444444"/>
-          <w:sz w:val="18"/>
-          <w:szCs w:val="18"/>
-        </w:rPr>
-        <w:t xml:space="preserve">Built campaign performance reporting frameworks (ROI, CAC, LTV, conversion KPIs) and delivered optimization recommendations and QBRs.</w:t>
+        <w:t xml:space="preserve">Managed integrated digital marketing strategies across inbound, paid media, and content, coordinating execution across internal departments as the strategic lead.</w:t>
+      </w:r>
+    </w:p>
+    <w:p>
+      <w:pPr>
+        <w:pStyle w:val="ListParagraph"/>
+        <w:numPr>
+          <w:ilvl w:val="0"/>
+          <w:numId w:val="1"/>
+        </w:numPr>
+        <w:spacing w:after="30"/>
+      </w:pPr>
+      <w:r>
+        <w:rPr>
+          <w:rFonts w:ascii="Calibri" w:cs="Calibri" w:eastAsia="Calibri" w:hAnsi="Calibri"/>
+          <w:color w:val="444444"/>
+          <w:sz w:val="18"/>
+          <w:szCs w:val="18"/>
+        </w:rPr>
+        <w:t xml:space="preserve">Built campaign performance reporting frameworks covering ROI, CAC, LTV, and conversion KPIs, and delivered optimization recommendations and QBRs.</w:t>
       </w:r>
     </w:p>
     <w:p>
@@ -497,7 +497,7 @@
           <w:sz w:val="19"/>
           <w:szCs w:val="19"/>
         </w:rPr>
-        <w:t xml:space="preserve">Channel Partnerships &amp; Customer Onboarding — Birdeye</w:t>
+        <w:t xml:space="preserve">Channel Partnerships &amp; Customer Onboarding · Birdeye</w:t>
       </w:r>
       <w:r>
         <w:rPr>
@@ -538,16 +538,36 @@
           <w:sz w:val="18"/>
           <w:szCs w:val="18"/>
         </w:rPr>
-        <w:t xml:space="preserve">15–20 reseller partners (deals ~$10K–$45K), retaining all but one (~94% retention)</w:t>
-      </w:r>
-      <w:r>
-        <w:rPr>
-          <w:rFonts w:ascii="Calibri" w:cs="Calibri" w:eastAsia="Calibri" w:hAnsi="Calibri"/>
-          <w:color w:val="444444"/>
-          <w:sz w:val="18"/>
-          <w:szCs w:val="18"/>
-        </w:rPr>
-        <w:t xml:space="preserve"> during tenure.</w:t>
+        <w:t xml:space="preserve">15 to 20 reseller partners</w:t>
+      </w:r>
+      <w:r>
+        <w:rPr>
+          <w:rFonts w:ascii="Calibri" w:cs="Calibri" w:eastAsia="Calibri" w:hAnsi="Calibri"/>
+          <w:color w:val="444444"/>
+          <w:sz w:val="18"/>
+          <w:szCs w:val="18"/>
+        </w:rPr>
+        <w:t xml:space="preserve">, with deals ranging from about $10K to $45K, and </w:t>
+      </w:r>
+      <w:r>
+        <w:rPr>
+          <w:rFonts w:ascii="Calibri" w:cs="Calibri" w:eastAsia="Calibri" w:hAnsi="Calibri"/>
+          <w:b/>
+          <w:bCs/>
+          <w:color w:val="000000"/>
+          <w:sz w:val="18"/>
+          <w:szCs w:val="18"/>
+        </w:rPr>
+        <w:t xml:space="preserve">retained all but one (roughly 94% retention)</w:t>
+      </w:r>
+      <w:r>
+        <w:rPr>
+          <w:rFonts w:ascii="Calibri" w:cs="Calibri" w:eastAsia="Calibri" w:hAnsi="Calibri"/>
+          <w:color w:val="444444"/>
+          <w:sz w:val="18"/>
+          <w:szCs w:val="18"/>
+        </w:rPr>
+        <w:t xml:space="preserve"> during my tenure.</w:t>
       </w:r>
     </w:p>
     <w:p>
@@ -585,7 +605,7 @@
           <w:sz w:val="18"/>
           <w:szCs w:val="18"/>
         </w:rPr>
-        <w:t xml:space="preserve">Served as trusted advisor on retention strategy, customer health metrics, and automated workflows; analyzed utilization to identify adoption gaps and reduce churn.</w:t>
+        <w:t xml:space="preserve">Served as trusted advisor on retention strategy, customer health metrics, and automated workflows, and analyzed utilization to spot adoption gaps and reduce churn.</w:t>
       </w:r>
     </w:p>
     <w:p>
@@ -604,7 +624,7 @@
           <w:sz w:val="19"/>
           <w:szCs w:val="19"/>
         </w:rPr>
-        <w:t xml:space="preserve">Account Executive / Sales Operations — Fetch &amp; Funnel</w:t>
+        <w:t xml:space="preserve">Account Executive / Sales Operations · Fetch &amp; Funnel</w:t>
       </w:r>
       <w:r>
         <w:rPr>
@@ -645,7 +665,7 @@
           <w:sz w:val="18"/>
           <w:szCs w:val="18"/>
         </w:rPr>
-        <w:t xml:space="preserve">6 new-client deals averaging ~$22K each (several exceeding $25K) — roughly $130K+ in total bookings</w:t>
+        <w:t xml:space="preserve">6 new-client deals averaging about $22K each, several above $25K, for roughly $130K+ in total bookings</w:t>
       </w:r>
       <w:r>
         <w:rPr>
@@ -692,7 +712,7 @@
           <w:sz w:val="19"/>
           <w:szCs w:val="19"/>
         </w:rPr>
-        <w:t xml:space="preserve">Account Manager, Onboarding Launch Specialist &amp; Team Lead — Wix.com</w:t>
+        <w:t xml:space="preserve">Account Manager, Onboarding Launch Specialist &amp; Team Lead · Wix.com</w:t>
       </w:r>
       <w:r>
         <w:rPr>
@@ -733,7 +753,7 @@
           <w:sz w:val="18"/>
           <w:szCs w:val="18"/>
         </w:rPr>
-        <w:t xml:space="preserve">30% increase in website traffic and 25% improvement in conversion rates</w:t>
+        <w:t xml:space="preserve">30% increase in website traffic and a 25% improvement in conversion rates</w:t>
       </w:r>
       <w:r>
         <w:rPr>
@@ -761,7 +781,7 @@
           <w:sz w:val="18"/>
           <w:szCs w:val="18"/>
         </w:rPr>
-        <w:t xml:space="preserve">Helped build a new Wix vertical from proof-of-concept to a profitable business line — contributing to hiring, onboarding, and training of new hires and developing sales training for tenured account executives.</w:t>
+        <w:t xml:space="preserve">Helped build a new Wix vertical from proof of concept to a profitable business line, contributing to hiring, onboarding, and training of new hires and developing sales training for tenured account executives.</w:t>
       </w:r>
     </w:p>
     <w:p>
@@ -799,7 +819,7 @@
           <w:sz w:val="19"/>
           <w:szCs w:val="19"/>
         </w:rPr>
-        <w:t xml:space="preserve">Account Executive — Accelo</w:t>
+        <w:t xml:space="preserve">Account Executive · Accelo</w:t>
       </w:r>
       <w:r>
         <w:rPr>
@@ -829,7 +849,7 @@
           <w:sz w:val="18"/>
           <w:szCs w:val="18"/>
         </w:rPr>
-        <w:t xml:space="preserve">Consistently performed above commission floor into accelerator ("doubling") tiers — averaging </w:t>
+        <w:t xml:space="preserve">Consistently performed above my commission floor into accelerator (“doubling”) tiers, averaging </w:t>
       </w:r>
       <w:r>
         <w:rPr>
@@ -840,35 +860,35 @@
           <w:sz w:val="18"/>
           <w:szCs w:val="18"/>
         </w:rPr>
-        <w:t xml:space="preserve">~$17,750/month in implementation/services bookings (~$213K annualized)</w:t>
-      </w:r>
-      <w:r>
-        <w:rPr>
-          <w:rFonts w:ascii="Calibri" w:cs="Calibri" w:eastAsia="Calibri" w:hAnsi="Calibri"/>
-          <w:color w:val="444444"/>
-          <w:sz w:val="18"/>
-          <w:szCs w:val="18"/>
-        </w:rPr>
-        <w:t xml:space="preserve"> plus new recurring revenue, earning roughly $9,300 in monthly performance commission.</w:t>
-      </w:r>
-    </w:p>
-    <w:p>
-      <w:pPr>
-        <w:pStyle w:val="ListParagraph"/>
-        <w:numPr>
-          <w:ilvl w:val="0"/>
-          <w:numId w:val="1"/>
-        </w:numPr>
-        <w:spacing w:after="30"/>
-      </w:pPr>
-      <w:r>
-        <w:rPr>
-          <w:rFonts w:ascii="Calibri" w:cs="Calibri" w:eastAsia="Calibri" w:hAnsi="Calibri"/>
-          <w:color w:val="444444"/>
-          <w:sz w:val="18"/>
-          <w:szCs w:val="18"/>
-        </w:rPr>
-        <w:t xml:space="preserve">Sold and scoped complex CRM and project-management software to agencies and professional-services firms; guided onboarding, workflow design, and API integrations as a trusted C-suite advisor.</w:t>
+        <w:t xml:space="preserve">about $17,750 per month in implementation and services bookings (roughly $213K annualized)</w:t>
+      </w:r>
+      <w:r>
+        <w:rPr>
+          <w:rFonts w:ascii="Calibri" w:cs="Calibri" w:eastAsia="Calibri" w:hAnsi="Calibri"/>
+          <w:color w:val="444444"/>
+          <w:sz w:val="18"/>
+          <w:szCs w:val="18"/>
+        </w:rPr>
+        <w:t xml:space="preserve"> plus new recurring revenue, and earned about $9,300 in monthly performance commission.</w:t>
+      </w:r>
+    </w:p>
+    <w:p>
+      <w:pPr>
+        <w:pStyle w:val="ListParagraph"/>
+        <w:numPr>
+          <w:ilvl w:val="0"/>
+          <w:numId w:val="1"/>
+        </w:numPr>
+        <w:spacing w:after="30"/>
+      </w:pPr>
+      <w:r>
+        <w:rPr>
+          <w:rFonts w:ascii="Calibri" w:cs="Calibri" w:eastAsia="Calibri" w:hAnsi="Calibri"/>
+          <w:color w:val="444444"/>
+          <w:sz w:val="18"/>
+          <w:szCs w:val="18"/>
+        </w:rPr>
+        <w:t xml:space="preserve">Sold and scoped complex CRM and project-management software to agencies and professional-services firms, guiding onboarding, workflow design, and API integrations as a trusted advisor to C-suite leaders.</w:t>
       </w:r>
     </w:p>
     <w:p>
@@ -887,7 +907,7 @@
           <w:sz w:val="19"/>
           <w:szCs w:val="19"/>
         </w:rPr>
-        <w:t xml:space="preserve">Account Executive — Fivestars</w:t>
+        <w:t xml:space="preserve">Account Executive · Fivestars</w:t>
       </w:r>
       <w:r>
         <w:rPr>
@@ -917,7 +937,7 @@
           <w:sz w:val="18"/>
           <w:szCs w:val="18"/>
         </w:rPr>
-        <w:t xml:space="preserve">Ran full-cycle sales for a loyalty and marketing-automation platform targeting SMBs — prospecting, qualification, and customer acquisition.</w:t>
+        <w:t xml:space="preserve">Ran full-cycle sales for a loyalty and marketing-automation platform targeting SMBs, covering prospecting, qualification, and customer acquisition.</w:t>
       </w:r>
     </w:p>
     <w:p>
@@ -936,7 +956,7 @@
           <w:sz w:val="19"/>
           <w:szCs w:val="19"/>
         </w:rPr>
-        <w:t xml:space="preserve">Business Development Representative — Senior Directory</w:t>
+        <w:t xml:space="preserve">Business Development Representative · Senior Directory</w:t>
       </w:r>
       <w:r>
         <w:rPr>
@@ -966,26 +986,26 @@
           <w:sz w:val="18"/>
           <w:szCs w:val="18"/>
         </w:rPr>
-        <w:t xml:space="preserve">Prospected and qualified leads as a Business Development Representative, booking appointments for regional sales representatives and maintaining a steady flow of sales-ready meetings.</w:t>
-      </w:r>
-    </w:p>
-    <w:p>
-      <w:pPr>
-        <w:pStyle w:val="ListParagraph"/>
-        <w:numPr>
-          <w:ilvl w:val="0"/>
-          <w:numId w:val="1"/>
-        </w:numPr>
-        <w:spacing w:after="30"/>
-      </w:pPr>
-      <w:r>
-        <w:rPr>
-          <w:rFonts w:ascii="Calibri" w:cs="Calibri" w:eastAsia="Calibri" w:hAnsi="Calibri"/>
-          <w:color w:val="444444"/>
-          <w:sz w:val="18"/>
-          <w:szCs w:val="18"/>
-        </w:rPr>
-        <w:t xml:space="preserve">Developed the consultative outreach, qualification, and pipeline-building fundamentals that carried into later SaaS Account Executive roles.</w:t>
+        <w:t xml:space="preserve">Prospected and qualified leads as a Business Development Representative, booking appointments for regional sales representatives and keeping a steady flow of sales-ready meetings.</w:t>
+      </w:r>
+    </w:p>
+    <w:p>
+      <w:pPr>
+        <w:pStyle w:val="ListParagraph"/>
+        <w:numPr>
+          <w:ilvl w:val="0"/>
+          <w:numId w:val="1"/>
+        </w:numPr>
+        <w:spacing w:after="30"/>
+      </w:pPr>
+      <w:r>
+        <w:rPr>
+          <w:rFonts w:ascii="Calibri" w:cs="Calibri" w:eastAsia="Calibri" w:hAnsi="Calibri"/>
+          <w:color w:val="444444"/>
+          <w:sz w:val="18"/>
+          <w:szCs w:val="18"/>
+        </w:rPr>
+        <w:t xml:space="preserve">Built the consultative outreach, qualification, and pipeline fundamentals that carried into later SaaS Account Executive roles.</w:t>
       </w:r>
     </w:p>
     <w:p>
@@ -1004,7 +1024,7 @@
           <w:sz w:val="19"/>
           <w:szCs w:val="19"/>
         </w:rPr>
-        <w:t xml:space="preserve">Co-Owner &amp; Operations Lead — Standing Akimbo</w:t>
+        <w:t xml:space="preserve">Co-Owner &amp; Operations Lead · Standing Akimbo</w:t>
       </w:r>
       <w:r>
         <w:rPr>
@@ -1034,7 +1054,7 @@
           <w:sz w:val="18"/>
           <w:szCs w:val="18"/>
         </w:rPr>
-        <w:t xml:space="preserve">Co-founded a startup in a highly regulated industry; built operational and compliance infrastructure from the ground up — intake processes, reporting systems, and customer, vendor, and supplier workflows — scaling the business to profitability.</w:t>
+        <w:t xml:space="preserve">Co-founded a startup in a highly regulated industry and built its operational and compliance infrastructure from the ground up, including intake processes, reporting systems, and customer, vendor, and supplier workflows, scaling the business to profitability.</w:t>
       </w:r>
     </w:p>
     <w:p>
@@ -1073,26 +1093,26 @@
           <w:sz w:val="18"/>
           <w:szCs w:val="18"/>
         </w:rPr>
-        <w:t xml:space="preserve">B.A. Liberal Arts, Minor in Political Science — Colorado State University, Fort Collins, CO</w:t>
-      </w:r>
-    </w:p>
-    <w:p>
-      <w:pPr>
-        <w:pStyle w:val="ListParagraph"/>
-        <w:numPr>
-          <w:ilvl w:val="0"/>
-          <w:numId w:val="1"/>
-        </w:numPr>
-        <w:spacing w:after="30"/>
-      </w:pPr>
-      <w:r>
-        <w:rPr>
-          <w:rFonts w:ascii="Calibri" w:cs="Calibri" w:eastAsia="Calibri" w:hAnsi="Calibri"/>
-          <w:color w:val="444444"/>
-          <w:sz w:val="18"/>
-          <w:szCs w:val="18"/>
-        </w:rPr>
-        <w:t xml:space="preserve">Google Digital Marketing &amp; E-Commerce Professional Certificate — Google / Coursera (2024)</w:t>
+        <w:t xml:space="preserve">B.A. Liberal Arts, Minor in Political Science · Colorado State University, Fort Collins, CO</w:t>
+      </w:r>
+    </w:p>
+    <w:p>
+      <w:pPr>
+        <w:pStyle w:val="ListParagraph"/>
+        <w:numPr>
+          <w:ilvl w:val="0"/>
+          <w:numId w:val="1"/>
+        </w:numPr>
+        <w:spacing w:after="30"/>
+      </w:pPr>
+      <w:r>
+        <w:rPr>
+          <w:rFonts w:ascii="Calibri" w:cs="Calibri" w:eastAsia="Calibri" w:hAnsi="Calibri"/>
+          <w:color w:val="444444"/>
+          <w:sz w:val="18"/>
+          <w:szCs w:val="18"/>
+        </w:rPr>
+        <w:t xml:space="preserve">Google Digital Marketing &amp; E-Commerce Professional Certificate · Google / Coursera (2024)</w:t>
       </w:r>
     </w:p>
     <w:p>
@@ -1138,7 +1158,7 @@
           <w:sz w:val="16"/>
           <w:szCs w:val="16"/>
         </w:rPr>
-        <w:t xml:space="preserve">  — Camille Ramirez, Manager, Account Management (direct manager, Wix)</w:t>
+        <w:t xml:space="preserve">  · Camille Ramirez, Manager, Account Management (direct manager, Wix)</w:t>
       </w:r>
     </w:p>
     <w:sectPr>

</xml_diff>

<commit_message>
Add job locations to resume and master profile
Co-Authored-By: Claude Opus 4.8 <noreply@anthropic.com>
Claude-Session: https://claude.ai/code/session_01GdRq6K4rhrYqfc6tg9hmug
</commit_message>
<xml_diff>
--- a/resumes/Joshua_Rotenberg_Resume.docx
+++ b/resumes/Joshua_Rotenberg_Resume.docx
@@ -275,7 +275,7 @@
           <w:sz w:val="18"/>
           <w:szCs w:val="18"/>
         </w:rPr>
-        <w:t xml:space="preserve">	Feb 2024 – Present</w:t>
+        <w:t xml:space="preserve">	Arvada, CO (Remote) · Feb 2024 – Present</w:t>
       </w:r>
     </w:p>
     <w:p>
@@ -440,7 +440,7 @@
           <w:sz w:val="18"/>
           <w:szCs w:val="18"/>
         </w:rPr>
-        <w:t xml:space="preserve">	Sep 2024 – Feb 2025</w:t>
+        <w:t xml:space="preserve">	Remote · Sep 2024 – Feb 2025</w:t>
       </w:r>
     </w:p>
     <w:p>
@@ -508,7 +508,7 @@
           <w:sz w:val="18"/>
           <w:szCs w:val="18"/>
         </w:rPr>
-        <w:t xml:space="preserve">	Feb 2023 – Apr 2024</w:t>
+        <w:t xml:space="preserve">	Remote · Feb 2023 – Apr 2024</w:t>
       </w:r>
     </w:p>
     <w:p>
@@ -635,7 +635,7 @@
           <w:sz w:val="18"/>
           <w:szCs w:val="18"/>
         </w:rPr>
-        <w:t xml:space="preserve">	Sep 2022 – Feb 2023</w:t>
+        <w:t xml:space="preserve">	Remote · Sep 2022 – Feb 2023</w:t>
       </w:r>
     </w:p>
     <w:p>
@@ -723,7 +723,7 @@
           <w:sz w:val="18"/>
           <w:szCs w:val="18"/>
         </w:rPr>
-        <w:t xml:space="preserve">	Aug 2020 – Aug 2022</w:t>
+        <w:t xml:space="preserve">	Remote · Aug 2020 – Aug 2022</w:t>
       </w:r>
     </w:p>
     <w:p>
@@ -830,7 +830,7 @@
           <w:sz w:val="18"/>
           <w:szCs w:val="18"/>
         </w:rPr>
-        <w:t xml:space="preserve">	Apr 2018 – Jul 2020</w:t>
+        <w:t xml:space="preserve">	Denver, CO · Apr 2018 – Jul 2020</w:t>
       </w:r>
     </w:p>
     <w:p>
@@ -918,7 +918,7 @@
           <w:sz w:val="18"/>
           <w:szCs w:val="18"/>
         </w:rPr>
-        <w:t xml:space="preserve">	2017 – 2018</w:t>
+        <w:t xml:space="preserve">	Denver, CO · 2017 – 2018</w:t>
       </w:r>
     </w:p>
     <w:p>
@@ -967,7 +967,7 @@
           <w:sz w:val="18"/>
           <w:szCs w:val="18"/>
         </w:rPr>
-        <w:t xml:space="preserve">	2012 – 2016</w:t>
+        <w:t xml:space="preserve">	Denver, CO · 2012 – 2016</w:t>
       </w:r>
     </w:p>
     <w:p>
@@ -1035,7 +1035,7 @@
           <w:sz w:val="18"/>
           <w:szCs w:val="18"/>
         </w:rPr>
-        <w:t xml:space="preserve">	Jun 2010 – Sep 2012</w:t>
+        <w:t xml:space="preserve">	Denver, CO · Jun 2010 – Sep 2012</w:t>
       </w:r>
     </w:p>
     <w:p>

</xml_diff>